<commit_message>
Auto save docs: WM Montagens Industriais/_qrcodes/nr 34 (08) (WM)_qrcode.png
</commit_message>
<xml_diff>
--- a/WM Montagens Industriais/nr 34 (08) (WM).docx
+++ b/WM Montagens Industriais/nr 34 (08) (WM).docx
@@ -220,7 +220,21 @@
                 <w:sz w:val="26"/>
                 <w:szCs w:val="26"/>
               </w:rPr>
-              <w:t>Obteve aproveitamento satisfatório no curso de capacitação em</w:t>
+              <w:t>Colaborador da empresa1, o</w:t>
+            </w:r>
+            <w:r>
+              <w:rPr>
+                <w:sz w:val="26"/>
+                <w:szCs w:val="26"/>
+              </w:rPr>
+              <w:t xml:space="preserve">bteve </w:t>
+            </w:r>
+            <w:r>
+              <w:rPr>
+                <w:sz w:val="26"/>
+                <w:szCs w:val="26"/>
+              </w:rPr>
+              <w:t>aproveitamento satisfatório no curso de capacitação em</w:t>
             </w:r>
             <w:r>
               <w:rPr>
@@ -245,7 +259,7 @@
                 <w:sz w:val="26"/>
                 <w:szCs w:val="26"/>
               </w:rPr>
-              <w:t>TRABALHO A QUENTE</w:t>
+              <w:t xml:space="preserve">NR 34 - </w:t>
             </w:r>
             <w:r>
               <w:rPr>
@@ -254,64 +268,7 @@
                 <w:sz w:val="26"/>
                 <w:szCs w:val="26"/>
               </w:rPr>
-              <w:t>”</w:t>
-            </w:r>
-            <w:r>
-              <w:rPr>
-                <w:sz w:val="26"/>
-                <w:szCs w:val="26"/>
-              </w:rPr>
-              <w:t>.</w:t>
-            </w:r>
-            <w:r>
-              <w:t xml:space="preserve"> </w:t>
-            </w:r>
-            <w:r>
-              <w:t>Aplicado c</w:t>
-            </w:r>
-            <w:r>
-              <w:rPr>
-                <w:sz w:val="26"/>
-                <w:szCs w:val="26"/>
-              </w:rPr>
-              <w:t xml:space="preserve">onforme as exigências da NR 34, da Portaria </w:t>
-            </w:r>
-            <w:proofErr w:type="spellStart"/>
-            <w:r>
-              <w:rPr>
-                <w:sz w:val="26"/>
-                <w:szCs w:val="26"/>
-              </w:rPr>
-              <w:t>MTb</w:t>
-            </w:r>
-            <w:proofErr w:type="spellEnd"/>
-            <w:r>
-              <w:rPr>
-                <w:sz w:val="26"/>
-                <w:szCs w:val="26"/>
-              </w:rPr>
-              <w:t xml:space="preserve"> nº 3.214/1978</w:t>
-            </w:r>
-            <w:r>
-              <w:rPr>
-                <w:sz w:val="26"/>
-                <w:szCs w:val="26"/>
-              </w:rPr>
-              <w:t>,</w:t>
-            </w:r>
-            <w:r>
-              <w:rPr>
-                <w:sz w:val="26"/>
-                <w:szCs w:val="26"/>
-              </w:rPr>
-              <w:t xml:space="preserve"> </w:t>
-            </w:r>
-            <w:r>
-              <w:rPr>
-                <w:sz w:val="26"/>
-                <w:szCs w:val="26"/>
-              </w:rPr>
-              <w:t xml:space="preserve">com carga horária de </w:t>
+              <w:t>TRABALHO A QUENTE</w:t>
             </w:r>
             <w:r>
               <w:rPr>
@@ -320,7 +277,48 @@
                 <w:sz w:val="26"/>
                 <w:szCs w:val="26"/>
               </w:rPr>
-              <w:t>0</w:t>
+              <w:t>”</w:t>
+            </w:r>
+            <w:r>
+              <w:rPr>
+                <w:sz w:val="26"/>
+                <w:szCs w:val="26"/>
+              </w:rPr>
+              <w:t>.</w:t>
+            </w:r>
+            <w:r>
+              <w:t xml:space="preserve"> </w:t>
+            </w:r>
+            <w:r>
+              <w:t>Aplicado c</w:t>
+            </w:r>
+            <w:r>
+              <w:rPr>
+                <w:sz w:val="26"/>
+                <w:szCs w:val="26"/>
+              </w:rPr>
+              <w:t>onforme as exigências da NR 34, da Portaria MTb nº 3.214/1978</w:t>
+            </w:r>
+            <w:r>
+              <w:rPr>
+                <w:sz w:val="26"/>
+                <w:szCs w:val="26"/>
+              </w:rPr>
+              <w:t>,</w:t>
+            </w:r>
+            <w:r>
+              <w:rPr>
+                <w:sz w:val="26"/>
+                <w:szCs w:val="26"/>
+              </w:rPr>
+              <w:t xml:space="preserve"> </w:t>
+            </w:r>
+            <w:r>
+              <w:rPr>
+                <w:sz w:val="26"/>
+                <w:szCs w:val="26"/>
+              </w:rPr>
+              <w:t xml:space="preserve">com carga horária de </w:t>
             </w:r>
             <w:r>
               <w:rPr>
@@ -329,7 +327,7 @@
                 <w:sz w:val="26"/>
                 <w:szCs w:val="26"/>
               </w:rPr>
-              <w:t>8</w:t>
+              <w:t>0</w:t>
             </w:r>
             <w:r>
               <w:rPr>
@@ -338,14 +336,7 @@
                 <w:sz w:val="26"/>
                 <w:szCs w:val="26"/>
               </w:rPr>
-              <w:t xml:space="preserve"> horas</w:t>
-            </w:r>
-            <w:r>
-              <w:rPr>
-                <w:sz w:val="26"/>
-                <w:szCs w:val="26"/>
-              </w:rPr>
-              <w:t xml:space="preserve"> e realizado no dia </w:t>
+              <w:t>8</w:t>
             </w:r>
             <w:r>
               <w:rPr>
@@ -354,28 +345,30 @@
                 <w:sz w:val="26"/>
                 <w:szCs w:val="26"/>
               </w:rPr>
-              <w:t>fim1</w:t>
+              <w:t xml:space="preserve"> horas</w:t>
             </w:r>
             <w:r>
               <w:rPr>
                 <w:sz w:val="26"/>
                 <w:szCs w:val="26"/>
               </w:rPr>
-              <w:t>,</w:t>
-            </w:r>
-            <w:r>
-              <w:rPr>
+              <w:t xml:space="preserve"> e realizado no dia </w:t>
+            </w:r>
+            <w:r>
+              <w:rPr>
+                <w:b/>
+                <w:bCs/>
                 <w:sz w:val="26"/>
                 <w:szCs w:val="26"/>
               </w:rPr>
-              <w:t xml:space="preserve"> </w:t>
+              <w:t>fim1</w:t>
             </w:r>
             <w:r>
               <w:rPr>
                 <w:sz w:val="26"/>
                 <w:szCs w:val="26"/>
               </w:rPr>
-              <w:t>nas dependências da empresa</w:t>
+              <w:t>,</w:t>
             </w:r>
             <w:r>
               <w:rPr>
@@ -389,21 +382,28 @@
                 <w:sz w:val="26"/>
                 <w:szCs w:val="26"/>
               </w:rPr>
-              <w:t>empresa1</w:t>
+              <w:t>nas dependências da empresa</w:t>
             </w:r>
             <w:r>
               <w:rPr>
                 <w:sz w:val="26"/>
                 <w:szCs w:val="26"/>
               </w:rPr>
-              <w:t xml:space="preserve">, localizada na </w:t>
+              <w:t xml:space="preserve"> Projetta Engenharia Consultoria e Treinamentos LTDA</w:t>
             </w:r>
             <w:r>
               <w:rPr>
                 <w:sz w:val="26"/>
                 <w:szCs w:val="26"/>
               </w:rPr>
-              <w:t>endereço1.</w:t>
+              <w:t xml:space="preserve">, localizada </w:t>
+            </w:r>
+            <w:r>
+              <w:rPr>
+                <w:sz w:val="26"/>
+                <w:szCs w:val="26"/>
+              </w:rPr>
+              <w:t>Av. Sagrado Coração de Jesus, 550, Jd. Boa Vista, Guariba (SP).</w:t>
             </w:r>
           </w:p>
         </w:tc>
@@ -434,7 +434,14 @@
           <w:sz w:val="26"/>
           <w:szCs w:val="26"/>
         </w:rPr>
-        <w:t>cidade1, fim2.</w:t>
+        <w:t>Guariba (SP)</w:t>
+      </w:r>
+      <w:r>
+        <w:rPr>
+          <w:sz w:val="26"/>
+          <w:szCs w:val="26"/>
+        </w:rPr>
+        <w:t>, fim2.</w:t>
       </w:r>
     </w:p>
     <w:p>
@@ -614,7 +621,7 @@
                       <w:noProof/>
                     </w:rPr>
                     <w:drawing>
-                      <wp:anchor distT="0" distB="0" distL="114300" distR="114300" simplePos="0" relativeHeight="251660288" behindDoc="1" locked="0" layoutInCell="1" allowOverlap="0" wp14:anchorId="06449569" wp14:editId="10248370">
+                      <wp:anchor distT="0" distB="0" distL="114300" distR="114300" simplePos="0" relativeHeight="251660288" behindDoc="1" locked="0" layoutInCell="1" allowOverlap="0" wp14:anchorId="06449569" wp14:editId="0F80ABF3">
                         <wp:simplePos x="0" y="0"/>
                         <wp:positionH relativeFrom="column">
                           <wp:posOffset>-180975</wp:posOffset>
@@ -1412,15 +1419,6 @@
         </w:rPr>
       </w:pPr>
     </w:p>
-    <w:p>
-      <w:pPr>
-        <w:jc w:val="center"/>
-        <w:rPr>
-          <w:sz w:val="26"/>
-          <w:szCs w:val="26"/>
-        </w:rPr>
-      </w:pPr>
-    </w:p>
     <w:tbl>
       <w:tblPr>
         <w:tblStyle w:val="Tabelacomgrade"/>
@@ -1437,7 +1435,7 @@
         <w:tblLook w:val="04A0" w:firstRow="1" w:lastRow="0" w:firstColumn="1" w:lastColumn="0" w:noHBand="0" w:noVBand="1"/>
       </w:tblPr>
       <w:tblGrid>
-        <w:gridCol w:w="7964"/>
+        <w:gridCol w:w="8696"/>
       </w:tblGrid>
       <w:tr>
         <w:trPr>
@@ -1449,23 +1447,106 @@
           </w:tcPr>
           <w:p>
             <w:pPr>
+              <w:spacing w:before="60" w:after="60" w:line="276" w:lineRule="auto"/>
+              <w:rPr>
+                <w:sz w:val="25"/>
+                <w:szCs w:val="25"/>
+              </w:rPr>
+            </w:pPr>
+            <w:r>
+              <w:rPr>
+                <w:sz w:val="25"/>
+                <w:szCs w:val="25"/>
+              </w:rPr>
+              <w:t xml:space="preserve">a) </w:t>
+            </w:r>
+            <w:r>
+              <w:rPr>
+                <w:sz w:val="25"/>
+                <w:szCs w:val="25"/>
+              </w:rPr>
+              <w:tab/>
+              <w:t>Estudo da NR</w:t>
+            </w:r>
+            <w:r>
+              <w:rPr>
+                <w:sz w:val="25"/>
+                <w:szCs w:val="25"/>
+              </w:rPr>
+              <w:t xml:space="preserve"> </w:t>
+            </w:r>
+            <w:r>
+              <w:rPr>
+                <w:sz w:val="25"/>
+                <w:szCs w:val="25"/>
+              </w:rPr>
+              <w:t>34, Item 34</w:t>
+            </w:r>
+            <w:r>
+              <w:rPr>
+                <w:sz w:val="25"/>
+                <w:szCs w:val="25"/>
+              </w:rPr>
+              <w:t>.</w:t>
+            </w:r>
+            <w:r>
+              <w:rPr>
+                <w:sz w:val="25"/>
+                <w:szCs w:val="25"/>
+              </w:rPr>
+              <w:t>5.</w:t>
+            </w:r>
+          </w:p>
+          <w:p>
+            <w:pPr>
+              <w:spacing w:before="60" w:after="60" w:line="276" w:lineRule="auto"/>
+              <w:rPr>
+                <w:sz w:val="25"/>
+                <w:szCs w:val="25"/>
+              </w:rPr>
+            </w:pPr>
+            <w:r>
+              <w:rPr>
+                <w:sz w:val="25"/>
+                <w:szCs w:val="25"/>
+              </w:rPr>
+              <w:t xml:space="preserve">b) </w:t>
+            </w:r>
+            <w:r>
+              <w:rPr>
+                <w:sz w:val="25"/>
+                <w:szCs w:val="25"/>
+              </w:rPr>
+              <w:tab/>
+              <w:t>Identificação de Perigos e Análise de Riscos</w:t>
+            </w:r>
+            <w:r>
+              <w:rPr>
+                <w:sz w:val="25"/>
+                <w:szCs w:val="25"/>
+              </w:rPr>
+              <w:t>:</w:t>
+            </w:r>
+          </w:p>
+          <w:p>
+            <w:pPr>
               <w:pStyle w:val="PargrafodaLista"/>
               <w:numPr>
                 <w:ilvl w:val="0"/>
                 <w:numId w:val="1"/>
               </w:numPr>
-              <w:spacing w:before="60" w:after="60" w:line="360" w:lineRule="auto"/>
-              <w:rPr>
-                <w:sz w:val="26"/>
-                <w:szCs w:val="26"/>
-              </w:rPr>
-            </w:pPr>
-            <w:r>
-              <w:rPr>
-                <w:sz w:val="26"/>
-                <w:szCs w:val="26"/>
-              </w:rPr>
-              <w:t>Definições: Combustível, inflamáveis e fonte de ignição;</w:t>
+              <w:spacing w:before="60" w:after="60" w:line="276" w:lineRule="auto"/>
+              <w:rPr>
+                <w:sz w:val="25"/>
+                <w:szCs w:val="25"/>
+              </w:rPr>
+            </w:pPr>
+            <w:r>
+              <w:rPr>
+                <w:sz w:val="25"/>
+                <w:szCs w:val="25"/>
+              </w:rPr>
+              <w:t>Conceitos de Perigos e Riscos,</w:t>
             </w:r>
           </w:p>
           <w:p>
@@ -1475,18 +1556,18 @@
                 <w:ilvl w:val="0"/>
                 <w:numId w:val="1"/>
               </w:numPr>
-              <w:spacing w:before="60" w:after="60" w:line="360" w:lineRule="auto"/>
-              <w:rPr>
-                <w:sz w:val="26"/>
-                <w:szCs w:val="26"/>
-              </w:rPr>
-            </w:pPr>
-            <w:r>
-              <w:rPr>
-                <w:sz w:val="26"/>
-                <w:szCs w:val="26"/>
-              </w:rPr>
-              <w:t>Trabalho a quente com energia reduzida;</w:t>
+              <w:spacing w:before="60" w:after="60" w:line="276" w:lineRule="auto"/>
+              <w:rPr>
+                <w:sz w:val="25"/>
+                <w:szCs w:val="25"/>
+              </w:rPr>
+            </w:pPr>
+            <w:r>
+              <w:rPr>
+                <w:sz w:val="25"/>
+                <w:szCs w:val="25"/>
+              </w:rPr>
+              <w:t>Técnicas de Identificação de Perigos e Análise de Riscos;</w:t>
             </w:r>
           </w:p>
           <w:p>
@@ -1496,18 +1577,97 @@
                 <w:ilvl w:val="0"/>
                 <w:numId w:val="1"/>
               </w:numPr>
-              <w:spacing w:before="60" w:after="60" w:line="360" w:lineRule="auto"/>
-              <w:rPr>
-                <w:sz w:val="26"/>
-                <w:szCs w:val="26"/>
-              </w:rPr>
-            </w:pPr>
-            <w:r>
-              <w:rPr>
-                <w:sz w:val="26"/>
-                <w:szCs w:val="26"/>
-              </w:rPr>
-              <w:t>Trabalho a quente com alta energia;</w:t>
+              <w:spacing w:before="60" w:after="60" w:line="276" w:lineRule="auto"/>
+              <w:rPr>
+                <w:sz w:val="25"/>
+                <w:szCs w:val="25"/>
+              </w:rPr>
+            </w:pPr>
+            <w:r>
+              <w:rPr>
+                <w:sz w:val="25"/>
+                <w:szCs w:val="25"/>
+              </w:rPr>
+              <w:t>APP e APR - Análise Preliminar de Perigos e Análise Preliminar de Riscos.</w:t>
+            </w:r>
+          </w:p>
+          <w:p>
+            <w:pPr>
+              <w:spacing w:before="60" w:after="60" w:line="276" w:lineRule="auto"/>
+              <w:rPr>
+                <w:sz w:val="25"/>
+                <w:szCs w:val="25"/>
+              </w:rPr>
+            </w:pPr>
+            <w:r>
+              <w:rPr>
+                <w:sz w:val="25"/>
+                <w:szCs w:val="25"/>
+              </w:rPr>
+              <w:t xml:space="preserve">c) </w:t>
+            </w:r>
+            <w:r>
+              <w:rPr>
+                <w:sz w:val="25"/>
+                <w:szCs w:val="25"/>
+              </w:rPr>
+              <w:tab/>
+              <w:t xml:space="preserve">Permissão para Trabalho - PT. </w:t>
+            </w:r>
+          </w:p>
+          <w:p>
+            <w:pPr>
+              <w:spacing w:before="60" w:after="60" w:line="276" w:lineRule="auto"/>
+              <w:rPr>
+                <w:sz w:val="25"/>
+                <w:szCs w:val="25"/>
+              </w:rPr>
+            </w:pPr>
+            <w:r>
+              <w:rPr>
+                <w:sz w:val="25"/>
+                <w:szCs w:val="25"/>
+              </w:rPr>
+              <w:t xml:space="preserve">d) </w:t>
+            </w:r>
+            <w:r>
+              <w:rPr>
+                <w:sz w:val="25"/>
+                <w:szCs w:val="25"/>
+              </w:rPr>
+              <w:tab/>
+              <w:t>Limite inferior e superior de explosividade.</w:t>
+            </w:r>
+          </w:p>
+          <w:p>
+            <w:pPr>
+              <w:spacing w:before="60" w:after="60" w:line="276" w:lineRule="auto"/>
+              <w:rPr>
+                <w:sz w:val="25"/>
+                <w:szCs w:val="25"/>
+              </w:rPr>
+            </w:pPr>
+            <w:r>
+              <w:rPr>
+                <w:sz w:val="25"/>
+                <w:szCs w:val="25"/>
+              </w:rPr>
+              <w:t>e)</w:t>
+            </w:r>
+            <w:r>
+              <w:rPr>
+                <w:sz w:val="25"/>
+                <w:szCs w:val="25"/>
+              </w:rPr>
+              <w:tab/>
+              <w:t>Medidas de Controle no Local de Trabalho</w:t>
+            </w:r>
+            <w:r>
+              <w:rPr>
+                <w:sz w:val="25"/>
+                <w:szCs w:val="25"/>
+              </w:rPr>
+              <w:t>:</w:t>
             </w:r>
           </w:p>
           <w:p>
@@ -1517,18 +1677,25 @@
                 <w:ilvl w:val="0"/>
                 <w:numId w:val="1"/>
               </w:numPr>
-              <w:spacing w:before="60" w:after="60" w:line="360" w:lineRule="auto"/>
-              <w:rPr>
-                <w:sz w:val="26"/>
-                <w:szCs w:val="26"/>
-              </w:rPr>
-            </w:pPr>
-            <w:r>
-              <w:rPr>
-                <w:sz w:val="26"/>
-                <w:szCs w:val="26"/>
-              </w:rPr>
-              <w:t>Fontes e potenciais;</w:t>
+              <w:spacing w:before="60" w:after="60" w:line="276" w:lineRule="auto"/>
+              <w:rPr>
+                <w:sz w:val="25"/>
+                <w:szCs w:val="25"/>
+              </w:rPr>
+            </w:pPr>
+            <w:r>
+              <w:rPr>
+                <w:sz w:val="25"/>
+                <w:szCs w:val="25"/>
+              </w:rPr>
+              <w:t>Inspeção Preliminar</w:t>
+            </w:r>
+            <w:r>
+              <w:rPr>
+                <w:sz w:val="25"/>
+                <w:szCs w:val="25"/>
+              </w:rPr>
+              <w:t>,</w:t>
             </w:r>
           </w:p>
           <w:p>
@@ -1538,18 +1705,18 @@
                 <w:ilvl w:val="0"/>
                 <w:numId w:val="1"/>
               </w:numPr>
-              <w:spacing w:before="60" w:after="60" w:line="360" w:lineRule="auto"/>
-              <w:rPr>
-                <w:sz w:val="26"/>
-                <w:szCs w:val="26"/>
-              </w:rPr>
-            </w:pPr>
-            <w:r>
-              <w:rPr>
-                <w:sz w:val="26"/>
-                <w:szCs w:val="26"/>
-              </w:rPr>
-              <w:t>Classificação de área: Restrita, geral e isenta;</w:t>
+              <w:spacing w:before="60" w:after="60" w:line="276" w:lineRule="auto"/>
+              <w:rPr>
+                <w:sz w:val="25"/>
+                <w:szCs w:val="25"/>
+              </w:rPr>
+            </w:pPr>
+            <w:r>
+              <w:rPr>
+                <w:sz w:val="25"/>
+                <w:szCs w:val="25"/>
+              </w:rPr>
+              <w:t>Controle de materiais combustíveis e inflamáveis,</w:t>
             </w:r>
           </w:p>
           <w:p>
@@ -1559,18 +1726,18 @@
                 <w:ilvl w:val="0"/>
                 <w:numId w:val="1"/>
               </w:numPr>
-              <w:spacing w:before="60" w:after="60" w:line="360" w:lineRule="auto"/>
-              <w:rPr>
-                <w:sz w:val="26"/>
-                <w:szCs w:val="26"/>
-              </w:rPr>
-            </w:pPr>
-            <w:r>
-              <w:rPr>
-                <w:sz w:val="26"/>
-                <w:szCs w:val="26"/>
-              </w:rPr>
-              <w:t>Permissões para trabalho a quente;</w:t>
+              <w:spacing w:before="60" w:after="60" w:line="276" w:lineRule="auto"/>
+              <w:rPr>
+                <w:sz w:val="25"/>
+                <w:szCs w:val="25"/>
+              </w:rPr>
+            </w:pPr>
+            <w:r>
+              <w:rPr>
+                <w:sz w:val="25"/>
+                <w:szCs w:val="25"/>
+              </w:rPr>
+              <w:t>Proteção Física,</w:t>
             </w:r>
           </w:p>
           <w:p>
@@ -1580,18 +1747,18 @@
                 <w:ilvl w:val="0"/>
                 <w:numId w:val="1"/>
               </w:numPr>
-              <w:spacing w:before="60" w:after="60" w:line="360" w:lineRule="auto"/>
-              <w:rPr>
-                <w:sz w:val="26"/>
-                <w:szCs w:val="26"/>
-              </w:rPr>
-            </w:pPr>
-            <w:r>
-              <w:rPr>
-                <w:sz w:val="26"/>
-                <w:szCs w:val="26"/>
-              </w:rPr>
-              <w:t>Observador de segurança para trabalho a quente;</w:t>
+              <w:spacing w:before="60" w:after="60" w:line="276" w:lineRule="auto"/>
+              <w:rPr>
+                <w:sz w:val="25"/>
+                <w:szCs w:val="25"/>
+              </w:rPr>
+            </w:pPr>
+            <w:r>
+              <w:rPr>
+                <w:sz w:val="25"/>
+                <w:szCs w:val="25"/>
+              </w:rPr>
+              <w:t>Atividades no entorno,</w:t>
             </w:r>
           </w:p>
           <w:p>
@@ -1601,18 +1768,18 @@
                 <w:ilvl w:val="0"/>
                 <w:numId w:val="1"/>
               </w:numPr>
-              <w:spacing w:before="60" w:after="60" w:line="360" w:lineRule="auto"/>
-              <w:rPr>
-                <w:sz w:val="26"/>
-                <w:szCs w:val="26"/>
-              </w:rPr>
-            </w:pPr>
-            <w:r>
-              <w:rPr>
-                <w:sz w:val="26"/>
-                <w:szCs w:val="26"/>
-              </w:rPr>
-              <w:t>Equipamentos para trabalho a quente: Maçarico, solda e corte;</w:t>
+              <w:spacing w:before="60" w:after="60" w:line="276" w:lineRule="auto"/>
+              <w:rPr>
+                <w:sz w:val="25"/>
+                <w:szCs w:val="25"/>
+              </w:rPr>
+            </w:pPr>
+            <w:r>
+              <w:rPr>
+                <w:sz w:val="25"/>
+                <w:szCs w:val="25"/>
+              </w:rPr>
+              <w:t>Sinalização e Isolamento do Local de Trabalho,</w:t>
             </w:r>
           </w:p>
           <w:p>
@@ -1622,78 +1789,143 @@
                 <w:ilvl w:val="0"/>
                 <w:numId w:val="1"/>
               </w:numPr>
-              <w:spacing w:before="60" w:after="60" w:line="360" w:lineRule="auto"/>
-              <w:rPr>
-                <w:sz w:val="26"/>
-                <w:szCs w:val="26"/>
-              </w:rPr>
-            </w:pPr>
-            <w:r>
-              <w:rPr>
-                <w:sz w:val="26"/>
-                <w:szCs w:val="26"/>
-              </w:rPr>
-              <w:t>Noções de resgate e primeiros socorros.</w:t>
+              <w:spacing w:before="60" w:after="60" w:line="276" w:lineRule="auto"/>
+              <w:rPr>
+                <w:sz w:val="25"/>
+                <w:szCs w:val="25"/>
+              </w:rPr>
+            </w:pPr>
+            <w:r>
+              <w:rPr>
+                <w:sz w:val="25"/>
+                <w:szCs w:val="25"/>
+              </w:rPr>
+              <w:t>Inspeção Posterior para controle de fontes de ignição.</w:t>
+            </w:r>
+          </w:p>
+          <w:p>
+            <w:pPr>
+              <w:spacing w:before="60" w:after="60" w:line="276" w:lineRule="auto"/>
+              <w:rPr>
+                <w:sz w:val="25"/>
+                <w:szCs w:val="25"/>
+              </w:rPr>
+            </w:pPr>
+            <w:r>
+              <w:rPr>
+                <w:sz w:val="25"/>
+                <w:szCs w:val="25"/>
+              </w:rPr>
+              <w:t>f)</w:t>
+            </w:r>
+            <w:r>
+              <w:rPr>
+                <w:sz w:val="25"/>
+                <w:szCs w:val="25"/>
+              </w:rPr>
+              <w:tab/>
+              <w:t>Renovação de Ar no Local de Trabalho (ventilação/exaustão).</w:t>
+            </w:r>
+          </w:p>
+          <w:p>
+            <w:pPr>
+              <w:spacing w:before="60" w:after="60" w:line="276" w:lineRule="auto"/>
+              <w:rPr>
+                <w:sz w:val="25"/>
+                <w:szCs w:val="25"/>
+              </w:rPr>
+            </w:pPr>
+            <w:r>
+              <w:rPr>
+                <w:sz w:val="25"/>
+                <w:szCs w:val="25"/>
+              </w:rPr>
+              <w:t xml:space="preserve">g) </w:t>
+            </w:r>
+            <w:r>
+              <w:rPr>
+                <w:sz w:val="25"/>
+                <w:szCs w:val="25"/>
+              </w:rPr>
+              <w:tab/>
+              <w:t>Rede de gases (Válvulas e Engates).</w:t>
+            </w:r>
+          </w:p>
+          <w:p>
+            <w:pPr>
+              <w:spacing w:before="60" w:after="60" w:line="276" w:lineRule="auto"/>
+              <w:rPr>
+                <w:sz w:val="25"/>
+                <w:szCs w:val="25"/>
+              </w:rPr>
+            </w:pPr>
+            <w:r>
+              <w:rPr>
+                <w:sz w:val="25"/>
+                <w:szCs w:val="25"/>
+              </w:rPr>
+              <w:t xml:space="preserve">h) </w:t>
+            </w:r>
+            <w:r>
+              <w:rPr>
+                <w:sz w:val="25"/>
+                <w:szCs w:val="25"/>
+              </w:rPr>
+              <w:tab/>
+              <w:t>Ergonomia.</w:t>
+            </w:r>
+          </w:p>
+          <w:p>
+            <w:pPr>
+              <w:spacing w:before="60" w:after="60" w:line="276" w:lineRule="auto"/>
+              <w:rPr>
+                <w:sz w:val="25"/>
+                <w:szCs w:val="25"/>
+              </w:rPr>
+            </w:pPr>
+            <w:r>
+              <w:rPr>
+                <w:sz w:val="25"/>
+                <w:szCs w:val="25"/>
+              </w:rPr>
+              <w:t xml:space="preserve">i) </w:t>
+            </w:r>
+            <w:r>
+              <w:rPr>
+                <w:sz w:val="25"/>
+                <w:szCs w:val="25"/>
+              </w:rPr>
+              <w:tab/>
+              <w:t>Doenças ocupacionais.</w:t>
+            </w:r>
+          </w:p>
+          <w:p>
+            <w:pPr>
+              <w:spacing w:before="60" w:after="60" w:line="276" w:lineRule="auto"/>
+              <w:rPr>
+                <w:sz w:val="25"/>
+                <w:szCs w:val="25"/>
+              </w:rPr>
+            </w:pPr>
+            <w:r>
+              <w:rPr>
+                <w:sz w:val="25"/>
+                <w:szCs w:val="25"/>
+              </w:rPr>
+              <w:t>j)</w:t>
+            </w:r>
+            <w:r>
+              <w:rPr>
+                <w:sz w:val="25"/>
+                <w:szCs w:val="25"/>
+              </w:rPr>
+              <w:tab/>
+              <w:t>FISPQ.</w:t>
             </w:r>
           </w:p>
         </w:tc>
       </w:tr>
     </w:tbl>
-    <w:p>
-      <w:pPr>
-        <w:pStyle w:val="PargrafodaLista"/>
-        <w:spacing w:before="60" w:after="60"/>
-        <w:ind w:left="0"/>
-        <w:rPr>
-          <w:sz w:val="26"/>
-          <w:szCs w:val="26"/>
-        </w:rPr>
-      </w:pPr>
-    </w:p>
-    <w:p>
-      <w:pPr>
-        <w:pStyle w:val="PargrafodaLista"/>
-        <w:spacing w:before="60" w:after="60"/>
-        <w:ind w:left="0"/>
-        <w:rPr>
-          <w:sz w:val="26"/>
-          <w:szCs w:val="26"/>
-        </w:rPr>
-      </w:pPr>
-    </w:p>
-    <w:p>
-      <w:pPr>
-        <w:pStyle w:val="PargrafodaLista"/>
-        <w:spacing w:before="60" w:after="60"/>
-        <w:ind w:left="0"/>
-        <w:rPr>
-          <w:sz w:val="26"/>
-          <w:szCs w:val="26"/>
-        </w:rPr>
-      </w:pPr>
-    </w:p>
-    <w:p>
-      <w:pPr>
-        <w:pStyle w:val="PargrafodaLista"/>
-        <w:spacing w:before="60" w:after="60"/>
-        <w:ind w:left="0"/>
-        <w:rPr>
-          <w:sz w:val="26"/>
-          <w:szCs w:val="26"/>
-        </w:rPr>
-      </w:pPr>
-    </w:p>
-    <w:p>
-      <w:pPr>
-        <w:pStyle w:val="PargrafodaLista"/>
-        <w:spacing w:before="60" w:after="60"/>
-        <w:ind w:left="0"/>
-        <w:rPr>
-          <w:sz w:val="26"/>
-          <w:szCs w:val="26"/>
-        </w:rPr>
-      </w:pPr>
-    </w:p>
     <w:p>
       <w:pPr>
         <w:pStyle w:val="PargrafodaLista"/>

</xml_diff>